<commit_message>
Atualiza leitor de e-mail, posts Instagram e scripts auxiliares
- prazos: refatora leitor_email.py e leitor_email_graph.py (Microsoft Graph)
- prazos/templates: atualiza index.html
- Adiciona salvar_posts_instagram.py e 11 imagens de posts do escritório
- Adiciona site_gastaoemoukarzel.zip
- Atualiza REsp v1 do caso Márcio Klaus e settings.json

Co-Authored-By: Claude Sonnet 4.6 <noreply@anthropic.com>
</commit_message>
<xml_diff>
--- a/MARCIO_KLAUS_MORAIS/output_claude/Márcio Klaus - REsp_v1.docx
+++ b/MARCIO_KLAUS_MORAIS/output_claude/Márcio Klaus - REsp_v1.docx
@@ -3205,14 +3205,7 @@
           <w:rFonts w:ascii="Arial" w:hAnsi="Arial"/>
           <w:sz w:val="24"/>
         </w:rPr>
-        <w:t xml:space="preserve"> o</w:t>
-      </w:r>
-      <w:r>
-        <w:rPr>
-          <w:rFonts w:ascii="Arial" w:hAnsi="Arial"/>
-          <w:sz w:val="24"/>
-        </w:rPr>
-        <w:t>s arts. 155 e 197 do C</w:t>
+        <w:t xml:space="preserve"> os arts. 155 e 197 do C</w:t>
       </w:r>
       <w:r>
         <w:rPr>
@@ -3283,14 +3276,7 @@
           <w:rFonts w:ascii="Arial" w:hAnsi="Arial"/>
           <w:sz w:val="24"/>
         </w:rPr>
-        <w:t xml:space="preserve"> e </w:t>
-      </w:r>
-      <w:r>
-        <w:rPr>
-          <w:rFonts w:ascii="Arial" w:hAnsi="Arial"/>
-          <w:sz w:val="24"/>
-        </w:rPr>
-        <w:t>o consequente redimensionamento da pena total e reavaliação do regime de cumprimento</w:t>
+        <w:t xml:space="preserve"> e o consequente redimensionamento da pena total e reavaliação do regime de cumprimento</w:t>
       </w:r>
       <w:r>
         <w:rPr>
@@ -3589,7 +3575,6 @@
         <w:docPartUnique/>
       </w:docPartObj>
     </w:sdtPr>
-    <w:sdtEndPr/>
     <w:sdtContent>
       <w:p>
         <w:pPr>

</xml_diff>